<commit_message>
fix: eliminate spec warnings and rename phase-based spec files
- Convert constants (OUTPUT_DIR, B) to let() in builder specs to fix
  "already initialized constant" warnings
- Rename phase-based spec files to feature-based names
- Remove phase references from describe blocks and comments
- Fix duplicate constant names across spec files
- Remove duplicate hunspell_available? method
- Add XML normalizers for round-trip spec comparisons
- Move benchmark gem to default group for Ruby 4.0 compat
- Rubocop auto-fixes
</commit_message>
<xml_diff>
--- a/spec/examples/generated/academic_paper.docx
+++ b/spec/examples/generated/academic_paper.docx
@@ -1,6 +1,6 @@
 
 <file path=word/document.xml><?xml version="1.0" encoding="UTF-8"?>
-<w:document xmlns:w="http://schemas.openxmlformats.org/wordprocessingml/2006/main">
+<w:document xmlns:w="http://schemas.openxmlformats.org/wordprocessingml/2006/main" xmlns:wpc="http://schemas.microsoft.com/office/word/2010/wordprocessingCanvas" xmlns:cx="http://schemas.microsoft.com/office/drawing/2014/chartex" xmlns:cx1="http://schemas.microsoft.com/office/drawing/2015/9/8/chartex" xmlns:cx2="http://schemas.microsoft.com/office/drawing/2015/10/21/chartex" xmlns:cx3="http://schemas.microsoft.com/office/drawing/2016/5/9/chartex" xmlns:cx4="http://schemas.microsoft.com/office/drawing/2016/5/10/chartex" xmlns:cx5="http://schemas.microsoft.com/office/drawing/2016/5/11/chartex" xmlns:cx6="http://schemas.microsoft.com/office/drawing/2016/5/12/chartex" xmlns:cx7="http://schemas.microsoft.com/office/drawing/2016/5/13/chartex" xmlns:cx8="http://schemas.microsoft.com/office/drawing/2016/5/14/chartex" xmlns:mc="http://schemas.openxmlformats.org/markup-compatibility/2006" xmlns:aink="http://schemas.microsoft.com/office/drawing/2016/ink" xmlns:am3d="http://schemas.microsoft.com/office/drawing/2017/model3d" xmlns:o="urn:schemas-microsoft-com:office:office" xmlns:oel="http://schemas.microsoft.com/office/2019/extlst" xmlns:r="http://schemas.openxmlformats.org/officeDocument/2006/relationships" xmlns:m="http://schemas.openxmlformats.org/officeDocument/2006/math" xmlns:v="urn:schemas-microsoft-com:vml" xmlns:wp14="http://schemas.microsoft.com/office/word/2010/wordprocessingDrawing" xmlns:wp="http://schemas.openxmlformats.org/drawingml/2006/wordprocessingDrawing" xmlns:w10="urn:schemas-microsoft-com:office:word" xmlns:w14="http://schemas.microsoft.com/office/word/2010/wordml" xmlns:w15="http://schemas.microsoft.com/office/word/2012/wordml" xmlns:w16cex="http://schemas.microsoft.com/office/word/2018/wordml/cex" xmlns:w16cid="http://schemas.microsoft.com/office/word/2016/wordml/cid" xmlns:w16="http://schemas.microsoft.com/office/word/2018/wordml" xmlns:w16du="http://schemas.microsoft.com/office/word/2023/wordml/word16du" xmlns:w16sdtdh="http://schemas.microsoft.com/office/word/2020/wordml/sdtdatahash" xmlns:w16sdtfl="http://schemas.microsoft.com/office/word/2024/wordml/sdtformatlock" xmlns:w16se="http://schemas.microsoft.com/office/word/2015/wordml/symex" xmlns:wpg="http://schemas.microsoft.com/office/word/2010/wordprocessingGroup" xmlns:wpi="http://schemas.microsoft.com/office/word/2010/wordprocessingInk" xmlns:wne="http://schemas.microsoft.com/office/word/2006/wordml" xmlns:wps="http://schemas.microsoft.com/office/word/2010/wordprocessingShape" mc:Ignorable="w14 w15 wp14">
   <w:body>
     <w:p>
       <w:pPr>
@@ -8,7 +8,6 @@
       </w:pPr>
       <w:r>
         <w:rPr>
-          <w:rFonts/>
           <w:sz w:val="48"/>
           <w:b/>
         </w:rPr>
@@ -41,7 +40,9 @@
       </w:r>
     </w:p>
     <w:p>
-      <w:pPr w:val="Heading1"/>
+      <w:pPr>
+        <w:pStyle w:val="Heading1"/>
+      </w:pPr>
       <w:r>
         <w:t>Abstract</w:t>
       </w:r>
@@ -66,7 +67,6 @@
     <w:p>
       <w:r>
         <w:rPr>
-          <w:rFonts/>
           <w:b/>
         </w:rPr>
         <w:t xml:space="preserve">Keywords: </w:t>
@@ -81,7 +81,9 @@
       </w:r>
     </w:p>
     <w:p>
-      <w:pPr w:val="Heading1"/>
+      <w:pPr>
+        <w:pStyle w:val="Heading1"/>
+      </w:pPr>
       <w:r>
         <w:t>1. Introduction</w:t>
       </w:r>
@@ -121,13 +123,17 @@
       </w:r>
     </w:p>
     <w:p>
-      <w:pPr w:val="Heading1"/>
+      <w:pPr>
+        <w:pStyle w:val="Heading1"/>
+      </w:pPr>
       <w:r>
         <w:t>2. Methodology</w:t>
       </w:r>
     </w:p>
     <w:p>
-      <w:pPr w:val="Heading2"/>
+      <w:pPr>
+        <w:pStyle w:val="Heading2"/>
+      </w:pPr>
       <w:r>
         <w:t>2.1 Architecture</w:t>
       </w:r>
@@ -182,7 +188,9 @@
       </w:r>
     </w:p>
     <w:p>
-      <w:pPr w:val="Heading2"/>
+      <w:pPr>
+        <w:pStyle w:val="Heading2"/>
+      </w:pPr>
       <w:r>
         <w:t>2.2 Implementation</w:t>
       </w:r>
@@ -202,7 +210,9 @@
       </w:r>
     </w:p>
     <w:p>
-      <w:pPr w:val="Heading1"/>
+      <w:pPr>
+        <w:pStyle w:val="Heading1"/>
+      </w:pPr>
       <w:r>
         <w:t>3. Results</w:t>
       </w:r>
@@ -216,29 +226,33 @@
       </w:r>
     </w:p>
     <w:p>
-      <w:pPr w:val="Heading2"/>
-      <w:r>
-        <w:t>3.1 Benchmark Results</w:t>
+      <w:pPr>
+        <w:pStyle w:val="Heading2"/>
+      </w:pPr>
+      <w:r>
+        <w:t>3.1 benchmark Results</w:t>
       </w:r>
     </w:p>
     <w:p>
       <w:r>
         <w:drawing>
-          <inline xmlns="http://schemas.openxmlformats.org/drawingml/2006/wordprocessingDrawing">
-            <extent wp:cx="5486400" wp:cy="3200400"/>
-            <effectExtent/>
-            <docPr wp:id="698612322" wp:name="Chart 601703"/>
+          <wp:inline>
+            <wp:extent wp:cx="5486400" wp:cy="3200400"/>
+            <wp:effectExtent/>
+            <wp:docPr wp:id="426917719" wp:name="Chart 507930"/>
             <graphic xmlns="http://schemas.openxmlformats.org/drawingml/2006/main">
               <graphicData uri="http://schemas.openxmlformats.org/drawingml/2006/chart">
                 <chart xmlns="http://schemas.openxmlformats.org/drawingml/2006/chart" c:id="rIdChart1"/>
               </graphicData>
             </graphic>
-          </inline>
+          </wp:inline>
         </w:drawing>
       </w:r>
     </w:p>
     <w:p>
-      <w:pPr w:val="Heading2"/>
+      <w:pPr>
+        <w:pStyle w:val="Heading2"/>
+      </w:pPr>
       <w:r>
         <w:t>3.2 Feature Coverage</w:t>
       </w:r>
@@ -246,21 +260,23 @@
     <w:p>
       <w:r>
         <w:drawing>
-          <inline xmlns="http://schemas.openxmlformats.org/drawingml/2006/wordprocessingDrawing">
-            <extent wp:cx="5486400" wp:cy="3200400"/>
-            <effectExtent/>
-            <docPr wp:id="467128466" wp:name="Chart 356941"/>
+          <wp:inline>
+            <wp:extent wp:cx="5486400" wp:cy="3200400"/>
+            <wp:effectExtent/>
+            <wp:docPr wp:id="128941180" wp:name="Chart 822517"/>
             <graphic xmlns="http://schemas.openxmlformats.org/drawingml/2006/main">
               <graphicData uri="http://schemas.openxmlformats.org/drawingml/2006/chart">
                 <chart xmlns="http://schemas.openxmlformats.org/drawingml/2006/chart" c:id="rIdChart2"/>
               </graphicData>
             </graphic>
-          </inline>
+          </wp:inline>
         </w:drawing>
       </w:r>
     </w:p>
     <w:p>
-      <w:pPr w:val="Heading1"/>
+      <w:pPr>
+        <w:pStyle w:val="Heading1"/>
+      </w:pPr>
       <w:r>
         <w:t>4. Conclusion</w:t>
       </w:r>
@@ -288,7 +304,9 @@
       </w:r>
     </w:p>
     <w:p>
-      <w:pPr w:val="Heading1"/>
+      <w:pPr>
+        <w:pStyle w:val="Heading1"/>
+      </w:pPr>
       <w:r>
         <w:t>References</w:t>
       </w:r>
@@ -306,8 +324,12 @@
       </w:sdt>
     </w:p>
     <w:sectPr>
-      <w:headerReference w:type="default" w:r:id="rIdHeader1"/>
-      <w:footerReference w:type="default" w:r:id="rIdFooter1"/>
+      <w:pgSz w:w="12240" w:h="15840"/>
+      <w:pgMar w:top="1440" w:bottom="1440" w:left="1440" w:right="1440" w:header="720" w:footer="720" w:gutter="0"/>
+      <w:cols w:space="720"/>
+      <w:headerReference w:type="default" r:id="rIdHeader1"/>
+      <w:footerReference w:type="default" r:id="rIdFooter1"/>
+      <w:docGrid w:linePitch="360"/>
     </w:sectPr>
   </w:body>
 </w:document>
@@ -326,23 +348,29 @@
 </w:ftr>
 </file>
 
-<file path=word/footnotes.xml><?xml version="1.0" encoding="UTF-8"?>
-<footnotes xmlns="http://schemas.openxmlformats.org/wordprocessingml/2006/main">
-  <footnote w:id="1" w:type="normal">
-    <p>
-      <r>
-        <t>ECMA-376: Office Open XML File Formats</t>
-      </r>
-    </p>
-  </footnote>
-  <footnote w:id="2" w:type="normal">
-    <p>
-      <r>
-        <t>See Johnson (2023) for a comparison of Ruby OOXML libraries.</t>
-      </r>
-    </p>
-  </footnote>
-</footnotes>
+<file path=word/footnotes.xml><?xml version="1.0" encoding="utf-8"?>
+<w:footnotes xmlns:w="http://schemas.openxmlformats.org/wordprocessingml/2006/main">
+  <w:footnote w:id="0" w:type="continuationSeparator">
+    <w:p/>
+  </w:footnote>
+  <w:footnote w:id="-1" w:type="separator">
+    <w:p/>
+  </w:footnote>
+  <w:footnote w:id="1" w:type="normal">
+    <w:p>
+      <w:r>
+        <w:t>ECMA-376: Office Open XML File Formats</w:t>
+      </w:r>
+    </w:p>
+  </w:footnote>
+  <w:footnote w:id="2" w:type="normal">
+    <w:p>
+      <w:r>
+        <w:t>See Johnson (2023) for a comparison of Ruby OOXML libraries.</w:t>
+      </w:r>
+    </w:p>
+  </w:footnote>
+</w:footnotes>
 </file>
 
 <file path=word/header1.xml><?xml version="1.0" encoding="utf-8"?>
@@ -359,72 +387,72 @@
 </w:hdr>
 </file>
 
-<file path=word/numbering.xml><?xml version="1.0" encoding="UTF-8"?>
-<numbering xmlns="http://schemas.openxmlformats.org/wordprocessingml/2006/main" xmlns:mc="http://schemas.openxmlformats.org/markup-compatibility/2006">
-  <abstractNum w:abstractNumId="0">
-    <lvl w:ilvl="0">
-      <start w:val="1"/>
-      <numFmt w:val="decimal"/>
-      <lvlJc w:val="left"/>
-      <ind w:left="720" w:hanging="360"/>
-    </lvl>
-    <lvl w:ilvl="1">
-      <start w:val="1"/>
-      <numFmt w:val="decimal"/>
-      <lvlJc w:val="left"/>
-      <ind w:left="1440" w:hanging="360"/>
-    </lvl>
-    <lvl w:ilvl="2">
-      <start w:val="1"/>
-      <numFmt w:val="decimal"/>
-      <lvlJc w:val="left"/>
-      <ind w:left="2160" w:hanging="360"/>
-    </lvl>
-    <lvl w:ilvl="3">
-      <start w:val="1"/>
-      <numFmt w:val="decimal"/>
-      <lvlJc w:val="left"/>
-      <ind w:left="2880" w:hanging="360"/>
-    </lvl>
-    <lvl w:ilvl="4">
-      <start w:val="1"/>
-      <numFmt w:val="decimal"/>
-      <lvlJc w:val="left"/>
-      <ind w:left="3600" w:hanging="360"/>
-    </lvl>
-    <lvl w:ilvl="5">
-      <start w:val="1"/>
-      <numFmt w:val="decimal"/>
-      <lvlJc w:val="left"/>
-      <ind w:left="4320" w:hanging="360"/>
-    </lvl>
-    <lvl w:ilvl="6">
-      <start w:val="1"/>
-      <numFmt w:val="decimal"/>
-      <lvlJc w:val="left"/>
-      <ind w:left="5040" w:hanging="360"/>
-    </lvl>
-    <lvl w:ilvl="7">
-      <start w:val="1"/>
-      <numFmt w:val="decimal"/>
-      <lvlJc w:val="left"/>
-      <ind w:left="5760" w:hanging="360"/>
-    </lvl>
-    <lvl w:ilvl="8">
-      <start w:val="1"/>
-      <numFmt w:val="decimal"/>
-      <lvlJc w:val="left"/>
-      <ind w:left="6480" w:hanging="360"/>
-    </lvl>
-  </abstractNum>
-  <num w:numId="1">
-    <abstractNumId w:val="0"/>
-  </num>
-</numbering>
+<file path=word/numbering.xml><?xml version="1.0" encoding="utf-8"?>
+<w:numbering xmlns:w="http://schemas.openxmlformats.org/wordprocessingml/2006/main" xmlns:mc="http://schemas.openxmlformats.org/markup-compatibility/2006">
+  <w:abstractNum w:abstractNumId="0">
+    <w:lvl w:ilvl="0">
+      <w:start w:val="1"/>
+      <w:numFmt w:val="decimal"/>
+      <w:lvlJc w:val="left"/>
+      <w:ind w:left="720" w:hanging="360"/>
+    </w:lvl>
+    <w:lvl w:ilvl="1">
+      <w:start w:val="1"/>
+      <w:numFmt w:val="decimal"/>
+      <w:lvlJc w:val="left"/>
+      <w:ind w:left="1440" w:hanging="360"/>
+    </w:lvl>
+    <w:lvl w:ilvl="2">
+      <w:start w:val="1"/>
+      <w:numFmt w:val="decimal"/>
+      <w:lvlJc w:val="left"/>
+      <w:ind w:left="2160" w:hanging="360"/>
+    </w:lvl>
+    <w:lvl w:ilvl="3">
+      <w:start w:val="1"/>
+      <w:numFmt w:val="decimal"/>
+      <w:lvlJc w:val="left"/>
+      <w:ind w:left="2880" w:hanging="360"/>
+    </w:lvl>
+    <w:lvl w:ilvl="4">
+      <w:start w:val="1"/>
+      <w:numFmt w:val="decimal"/>
+      <w:lvlJc w:val="left"/>
+      <w:ind w:left="3600" w:hanging="360"/>
+    </w:lvl>
+    <w:lvl w:ilvl="5">
+      <w:start w:val="1"/>
+      <w:numFmt w:val="decimal"/>
+      <w:lvlJc w:val="left"/>
+      <w:ind w:left="4320" w:hanging="360"/>
+    </w:lvl>
+    <w:lvl w:ilvl="6">
+      <w:start w:val="1"/>
+      <w:numFmt w:val="decimal"/>
+      <w:lvlJc w:val="left"/>
+      <w:ind w:left="5040" w:hanging="360"/>
+    </w:lvl>
+    <w:lvl w:ilvl="7">
+      <w:start w:val="1"/>
+      <w:numFmt w:val="decimal"/>
+      <w:lvlJc w:val="left"/>
+      <w:ind w:left="5760" w:hanging="360"/>
+    </w:lvl>
+    <w:lvl w:ilvl="8">
+      <w:start w:val="1"/>
+      <w:numFmt w:val="decimal"/>
+      <w:lvlJc w:val="left"/>
+      <w:ind w:left="6480" w:hanging="360"/>
+    </w:lvl>
+  </w:abstractNum>
+  <w:num w:numId="1">
+    <w:abstractNumId w:val="0"/>
+  </w:num>
+</w:numbering>
 </file>
 
 <file path=word/sources.xml><?xml version="1.0" encoding="UTF-8"?>
-<sources xmlns="http://schemas.openxmlformats.org/officeDocument/2006/bibliography" b:SelectedStyle="APA">
+<Sources xmlns="http://schemas.openxmlformats.org/officeDocument/2006/bibliography" b:SelectedStyle="APA">
   <Source>
     <SourceType>Book</SourceType>
     <Tag>ECMA2024</Tag>
@@ -492,186 +520,599 @@
     <URL>https://github.com/mulgogi/uniword</URL>
     <RefOrder>4</RefOrder>
   </Source>
-</sources>
+</Sources>
 </file>
 
-<file path=word/styles.xml><?xml version="1.0" encoding="UTF-8"?>
-<styles xmlns="http://schemas.openxmlformats.org/wordprocessingml/2006/main" xmlns:mc="http://schemas.openxmlformats.org/markup-compatibility/2006">
-  <style w:type="paragraph" w:styleId="Normal" w:default="1">
-    <name w:val="Normal"/>
-    <qFormat/>
-  </style>
-  <style w:type="character" w:styleId="DefaultParagraphFont" w:default="1">
-    <name w:val="Default Paragraph Font"/>
-  </style>
-  <style w:type="paragraph" w:styleId="Heading1">
-    <name w:val="Heading 1"/>
-    <basedOn w:val="Normal"/>
-    <next w:val="Normal"/>
-    <uiPriority w:val="9"/>
-    <qFormat/>
-    <pPr>
-      <spacing w:before="320" w:after="0"/>
-      <outlineLvl/>
-    </pPr>
-    <rPr>
-      <rFonts/>
-      <sz/>
-      <b/>
-      <color/>
-    </rPr>
-  </style>
-  <style w:type="paragraph" w:styleId="Heading2">
-    <name w:val="Heading 2"/>
-    <basedOn w:val="Normal"/>
-    <next w:val="Normal"/>
-    <uiPriority w:val="10"/>
-    <qFormat/>
-    <pPr>
-      <spacing w:before="400" w:after="0"/>
-      <outlineLvl/>
-    </pPr>
-    <rPr>
-      <rFonts/>
-      <sz/>
-      <b/>
-      <color/>
-    </rPr>
-  </style>
-  <style w:type="paragraph" w:styleId="Heading3">
-    <name w:val="Heading 3"/>
-    <basedOn w:val="Normal"/>
-    <next w:val="Normal"/>
-    <uiPriority w:val="11"/>
-    <qFormat/>
-    <pPr>
-      <spacing w:before="480" w:after="0"/>
-      <outlineLvl/>
-    </pPr>
-    <rPr>
-      <rFonts/>
-      <sz/>
-      <b/>
-      <color/>
-    </rPr>
-  </style>
-  <style w:type="paragraph" w:styleId="Heading4">
-    <name w:val="Heading 4"/>
-    <basedOn w:val="Normal"/>
-    <next w:val="Normal"/>
-    <uiPriority w:val="12"/>
-    <qFormat/>
-    <pPr>
-      <spacing w:before="560" w:after="0"/>
-      <outlineLvl/>
-    </pPr>
-    <rPr>
-      <rFonts/>
-      <sz/>
-      <b/>
-      <color/>
-    </rPr>
-  </style>
-  <style w:type="paragraph" w:styleId="Heading5">
-    <name w:val="Heading 5"/>
-    <basedOn w:val="Normal"/>
-    <next w:val="Normal"/>
-    <uiPriority w:val="13"/>
-    <qFormat/>
-    <pPr>
-      <spacing w:before="640" w:after="0"/>
-      <outlineLvl/>
-    </pPr>
-    <rPr>
-      <rFonts/>
-      <sz/>
-      <b/>
-      <color/>
-    </rPr>
-  </style>
-  <style w:type="paragraph" w:styleId="Heading6">
-    <name w:val="Heading 6"/>
-    <basedOn w:val="Normal"/>
-    <next w:val="Normal"/>
-    <uiPriority w:val="14"/>
-    <qFormat/>
-    <pPr>
-      <spacing w:before="720" w:after="0"/>
-      <outlineLvl/>
-    </pPr>
-    <rPr>
-      <rFonts/>
-      <sz/>
-      <b/>
-      <color/>
-    </rPr>
-  </style>
-  <style w:type="paragraph" w:styleId="Heading7">
-    <name w:val="Heading 7"/>
-    <basedOn w:val="Normal"/>
-    <next w:val="Normal"/>
-    <uiPriority w:val="15"/>
-    <qFormat/>
-    <pPr>
-      <spacing w:before="800" w:after="0"/>
-      <outlineLvl/>
-    </pPr>
-    <rPr>
-      <rFonts/>
-      <sz/>
-      <b/>
-      <color/>
-    </rPr>
-  </style>
-  <style w:type="paragraph" w:styleId="Heading8">
-    <name w:val="Heading 8"/>
-    <basedOn w:val="Normal"/>
-    <next w:val="Normal"/>
-    <uiPriority w:val="16"/>
-    <qFormat/>
-    <pPr>
-      <spacing w:before="880" w:after="0"/>
-      <outlineLvl/>
-    </pPr>
-    <rPr>
-      <rFonts/>
-      <sz/>
-      <b/>
-      <color/>
-    </rPr>
-  </style>
-  <style w:type="paragraph" w:styleId="Heading9">
-    <name w:val="Heading 9"/>
-    <basedOn w:val="Normal"/>
-    <next w:val="Normal"/>
-    <uiPriority w:val="17"/>
-    <qFormat/>
-    <pPr>
-      <spacing w:before="960" w:after="0"/>
-      <outlineLvl/>
-    </pPr>
-    <rPr>
-      <rFonts/>
-      <sz/>
-      <b/>
-      <color/>
-    </rPr>
-  </style>
-  <style w:type="character" w:styleId="Emphasis" w:customStyle="1">
-    <name w:val="Emphasis"/>
-    <rPr>
-      <rFonts/>
-      <i/>
-    </rPr>
-  </style>
-  <style w:type="character" w:styleId="Strong" w:customStyle="1">
-    <name w:val="Strong"/>
-    <rPr>
-      <rFonts/>
-      <b/>
-    </rPr>
-  </style>
-</styles>
+<file path=word/styles.xml><?xml version="1.0" encoding="utf-8"?>
+<w:styles xmlns:w="http://schemas.openxmlformats.org/wordprocessingml/2006/main" xmlns:mc="http://schemas.openxmlformats.org/markup-compatibility/2006" xmlns:r="http://schemas.openxmlformats.org/officeDocument/2006/relationships" xmlns:w14="http://schemas.microsoft.com/office/word/2010/wordml" xmlns:w15="http://schemas.microsoft.com/office/word/2012/wordml" xmlns:w16cex="http://schemas.microsoft.com/office/word/2018/wordml/cex" xmlns:w16cid="http://schemas.microsoft.com/office/word/2016/wordml/cid" xmlns:w16="http://schemas.microsoft.com/office/word/2018/wordml" xmlns:w16du="http://schemas.microsoft.com/office/word/2023/wordml/word16du" xmlns:w16sdtdh="http://schemas.microsoft.com/office/word/2020/wordml/sdtdatahash" xmlns:w16sdtfl="http://schemas.microsoft.com/office/word/2024/wordml/sdtformatlock" xmlns:w16se="http://schemas.microsoft.com/office/word/2015/wordml/symex" mc:Ignorable="w14 w15 w16se w16cid w16 w16cex w16sdtdh w16sdtfl w16du">
+  <w:docDefaults>
+    <w:rPrDefault>
+      <w:rPr>
+        <w:rFonts w:asciiTheme="minorHAnsi" w:eastAsiaTheme="minorEastAsia" w:hAnsiTheme="minorHAnsi" w:cstheme="minorBidi"/>
+        <w:sz/>
+        <w:szCs/>
+        <w:kern/>
+        <w:lang w:val="en-US" w:eastAsia="zh-CN" w:bidi="ar-SA"/>
+      </w:rPr>
+    </w:rPrDefault>
+    <w:pPrDefault>
+      <w:pPr>
+        <w:spacing w:after="160" w:line="278" w:lineRule="auto"/>
+      </w:pPr>
+    </w:pPrDefault>
+  </w:docDefaults>
+  <w:latentStyles w:defLockedState="0" w:defUIPriority="99" w:defSemiHidden="0" w:defUnhideWhenUsed="0" w:defQFormat="0" w:count="376">
+    <w:lsdException w:name="Normal" w:uiPriority="0" w:qFormat="1"/>
+    <w:lsdException w:name="heading 1" w:uiPriority="9" w:qFormat="1"/>
+    <w:lsdException w:name="heading 2" w:uiPriority="9" w:qFormat="1" w:semiHidden="1" w:unhideWhenUsed="1"/>
+    <w:lsdException w:name="heading 3" w:uiPriority="9" w:qFormat="1" w:semiHidden="1" w:unhideWhenUsed="1"/>
+    <w:lsdException w:name="heading 4" w:uiPriority="9" w:qFormat="1" w:semiHidden="1" w:unhideWhenUsed="1"/>
+    <w:lsdException w:name="heading 5" w:uiPriority="9" w:qFormat="1" w:semiHidden="1" w:unhideWhenUsed="1"/>
+    <w:lsdException w:name="heading 6" w:uiPriority="9" w:qFormat="1" w:semiHidden="1" w:unhideWhenUsed="1"/>
+    <w:lsdException w:name="heading 7" w:uiPriority="9" w:qFormat="1" w:semiHidden="1" w:unhideWhenUsed="1"/>
+    <w:lsdException w:name="heading 8" w:uiPriority="9" w:qFormat="1" w:semiHidden="1" w:unhideWhenUsed="1"/>
+    <w:lsdException w:name="heading 9" w:uiPriority="9" w:qFormat="1" w:semiHidden="1" w:unhideWhenUsed="1"/>
+    <w:lsdException w:name="index 1" w:semiHidden="1" w:unhideWhenUsed="1"/>
+    <w:lsdException w:name="index 2" w:semiHidden="1" w:unhideWhenUsed="1"/>
+    <w:lsdException w:name="index 3" w:semiHidden="1" w:unhideWhenUsed="1"/>
+    <w:lsdException w:name="index 4" w:semiHidden="1" w:unhideWhenUsed="1"/>
+    <w:lsdException w:name="index 5" w:semiHidden="1" w:unhideWhenUsed="1"/>
+    <w:lsdException w:name="index 6" w:semiHidden="1" w:unhideWhenUsed="1"/>
+    <w:lsdException w:name="index 7" w:semiHidden="1" w:unhideWhenUsed="1"/>
+    <w:lsdException w:name="index 8" w:semiHidden="1" w:unhideWhenUsed="1"/>
+    <w:lsdException w:name="index 9" w:semiHidden="1" w:unhideWhenUsed="1"/>
+    <w:lsdException w:name="toc 1" w:uiPriority="39" w:semiHidden="1" w:unhideWhenUsed="1"/>
+    <w:lsdException w:name="toc 2" w:uiPriority="39" w:semiHidden="1" w:unhideWhenUsed="1"/>
+    <w:lsdException w:name="toc 3" w:uiPriority="39" w:semiHidden="1" w:unhideWhenUsed="1"/>
+    <w:lsdException w:name="toc 4" w:uiPriority="39" w:semiHidden="1" w:unhideWhenUsed="1"/>
+    <w:lsdException w:name="toc 5" w:uiPriority="39" w:semiHidden="1" w:unhideWhenUsed="1"/>
+    <w:lsdException w:name="toc 6" w:uiPriority="39" w:semiHidden="1" w:unhideWhenUsed="1"/>
+    <w:lsdException w:name="toc 7" w:uiPriority="39" w:semiHidden="1" w:unhideWhenUsed="1"/>
+    <w:lsdException w:name="toc 8" w:uiPriority="39" w:semiHidden="1" w:unhideWhenUsed="1"/>
+    <w:lsdException w:name="toc 9" w:uiPriority="39" w:semiHidden="1" w:unhideWhenUsed="1"/>
+    <w:lsdException w:name="Normal Indent" w:semiHidden="1" w:unhideWhenUsed="1"/>
+    <w:lsdException w:name="footnote text" w:semiHidden="1" w:unhideWhenUsed="1"/>
+    <w:lsdException w:name="annotation text" w:semiHidden="1" w:unhideWhenUsed="1"/>
+    <w:lsdException w:name="header" w:semiHidden="1" w:unhideWhenUsed="1"/>
+    <w:lsdException w:name="footer" w:semiHidden="1" w:unhideWhenUsed="1"/>
+    <w:lsdException w:name="index heading" w:semiHidden="1" w:unhideWhenUsed="1"/>
+    <w:lsdException w:name="caption" w:uiPriority="35" w:qFormat="1" w:semiHidden="1" w:unhideWhenUsed="1"/>
+    <w:lsdException w:name="table of figures" w:semiHidden="1" w:unhideWhenUsed="1"/>
+    <w:lsdException w:name="envelope address" w:semiHidden="1" w:unhideWhenUsed="1"/>
+    <w:lsdException w:name="envelope return" w:semiHidden="1" w:unhideWhenUsed="1"/>
+    <w:lsdException w:name="footnote reference" w:semiHidden="1" w:unhideWhenUsed="1"/>
+    <w:lsdException w:name="annotation reference" w:semiHidden="1" w:unhideWhenUsed="1"/>
+    <w:lsdException w:name="line number" w:semiHidden="1" w:unhideWhenUsed="1"/>
+    <w:lsdException w:name="page number" w:semiHidden="1" w:unhideWhenUsed="1"/>
+    <w:lsdException w:name="endnote reference" w:semiHidden="1" w:unhideWhenUsed="1"/>
+    <w:lsdException w:name="endnote text" w:semiHidden="1" w:unhideWhenUsed="1"/>
+    <w:lsdException w:name="table of authorities" w:semiHidden="1" w:unhideWhenUsed="1"/>
+    <w:lsdException w:name="macro" w:semiHidden="1" w:unhideWhenUsed="1"/>
+    <w:lsdException w:name="toa heading" w:semiHidden="1" w:unhideWhenUsed="1"/>
+    <w:lsdException w:name="List" w:semiHidden="1" w:unhideWhenUsed="1"/>
+    <w:lsdException w:name="List Bullet" w:semiHidden="1" w:unhideWhenUsed="1"/>
+    <w:lsdException w:name="List Number" w:semiHidden="1" w:unhideWhenUsed="1"/>
+    <w:lsdException w:name="List 2" w:semiHidden="1" w:unhideWhenUsed="1"/>
+    <w:lsdException w:name="List 3" w:semiHidden="1" w:unhideWhenUsed="1"/>
+    <w:lsdException w:name="List 4" w:semiHidden="1" w:unhideWhenUsed="1"/>
+    <w:lsdException w:name="List 5" w:semiHidden="1" w:unhideWhenUsed="1"/>
+    <w:lsdException w:name="List Bullet 2" w:semiHidden="1" w:unhideWhenUsed="1"/>
+    <w:lsdException w:name="List Bullet 3" w:semiHidden="1" w:unhideWhenUsed="1"/>
+    <w:lsdException w:name="List Bullet 4" w:semiHidden="1" w:unhideWhenUsed="1"/>
+    <w:lsdException w:name="List Bullet 5" w:semiHidden="1" w:unhideWhenUsed="1"/>
+    <w:lsdException w:name="List Number 2" w:semiHidden="1" w:unhideWhenUsed="1"/>
+    <w:lsdException w:name="List Number 3" w:semiHidden="1" w:unhideWhenUsed="1"/>
+    <w:lsdException w:name="List Number 4" w:semiHidden="1" w:unhideWhenUsed="1"/>
+    <w:lsdException w:name="List Number 5" w:semiHidden="1" w:unhideWhenUsed="1"/>
+    <w:lsdException w:name="Title" w:uiPriority="10" w:qFormat="1"/>
+    <w:lsdException w:name="Closing" w:semiHidden="1" w:unhideWhenUsed="1"/>
+    <w:lsdException w:name="Signature" w:semiHidden="1" w:unhideWhenUsed="1"/>
+    <w:lsdException w:name="Default Paragraph Font" w:uiPriority="1" w:semiHidden="1" w:unhideWhenUsed="1"/>
+    <w:lsdException w:name="Body Text" w:semiHidden="1" w:unhideWhenUsed="1"/>
+    <w:lsdException w:name="Body Text Indent" w:semiHidden="1" w:unhideWhenUsed="1"/>
+    <w:lsdException w:name="List Continue" w:semiHidden="1" w:unhideWhenUsed="1"/>
+    <w:lsdException w:name="List Continue 2" w:semiHidden="1" w:unhideWhenUsed="1"/>
+    <w:lsdException w:name="List Continue 3" w:semiHidden="1" w:unhideWhenUsed="1"/>
+    <w:lsdException w:name="List Continue 4" w:semiHidden="1" w:unhideWhenUsed="1"/>
+    <w:lsdException w:name="List Continue 5" w:semiHidden="1" w:unhideWhenUsed="1"/>
+    <w:lsdException w:name="Message Header" w:semiHidden="1" w:unhideWhenUsed="1"/>
+    <w:lsdException w:name="Subtitle" w:uiPriority="11" w:qFormat="1"/>
+    <w:lsdException w:name="Salutation" w:semiHidden="1" w:unhideWhenUsed="1"/>
+    <w:lsdException w:name="Date" w:semiHidden="1" w:unhideWhenUsed="1"/>
+    <w:lsdException w:name="Body Text First Indent" w:semiHidden="1" w:unhideWhenUsed="1"/>
+    <w:lsdException w:name="Body Text First Indent 2" w:semiHidden="1" w:unhideWhenUsed="1"/>
+    <w:lsdException w:name="Note Heading" w:semiHidden="1" w:unhideWhenUsed="1"/>
+    <w:lsdException w:name="Body Text 2" w:semiHidden="1" w:unhideWhenUsed="1"/>
+    <w:lsdException w:name="Body Text 3" w:semiHidden="1" w:unhideWhenUsed="1"/>
+    <w:lsdException w:name="Body Text Indent 2" w:semiHidden="1" w:unhideWhenUsed="1"/>
+    <w:lsdException w:name="Body Text Indent 3" w:semiHidden="1" w:unhideWhenUsed="1"/>
+    <w:lsdException w:name="Block Text" w:semiHidden="1" w:unhideWhenUsed="1"/>
+    <w:lsdException w:name="Hyperlink" w:semiHidden="1" w:unhideWhenUsed="1"/>
+    <w:lsdException w:name="FollowedHyperlink" w:semiHidden="1" w:unhideWhenUsed="1"/>
+    <w:lsdException w:name="Strong" w:uiPriority="22" w:qFormat="1"/>
+    <w:lsdException w:name="Emphasis" w:uiPriority="20" w:qFormat="1"/>
+    <w:lsdException w:name="Document Map" w:semiHidden="1" w:unhideWhenUsed="1"/>
+    <w:lsdException w:name="Plain Text" w:semiHidden="1" w:unhideWhenUsed="1"/>
+    <w:lsdException w:name="E-mail Signature" w:semiHidden="1" w:unhideWhenUsed="1"/>
+    <w:lsdException w:name="HTML Top of Form" w:semiHidden="1" w:unhideWhenUsed="1"/>
+    <w:lsdException w:name="HTML Bottom of Form" w:semiHidden="1" w:unhideWhenUsed="1"/>
+    <w:lsdException w:name="Normal (Web)" w:semiHidden="1" w:unhideWhenUsed="1"/>
+    <w:lsdException w:name="HTML Acronym" w:semiHidden="1" w:unhideWhenUsed="1"/>
+    <w:lsdException w:name="HTML Address" w:semiHidden="1" w:unhideWhenUsed="1"/>
+    <w:lsdException w:name="HTML Cite" w:semiHidden="1" w:unhideWhenUsed="1"/>
+    <w:lsdException w:name="HTML Code" w:semiHidden="1" w:unhideWhenUsed="1"/>
+    <w:lsdException w:name="HTML Definition" w:semiHidden="1" w:unhideWhenUsed="1"/>
+    <w:lsdException w:name="HTML Keyboard" w:semiHidden="1" w:unhideWhenUsed="1"/>
+    <w:lsdException w:name="HTML Preformatted" w:semiHidden="1" w:unhideWhenUsed="1"/>
+    <w:lsdException w:name="HTML Sample" w:semiHidden="1" w:unhideWhenUsed="1"/>
+    <w:lsdException w:name="HTML Typewriter" w:semiHidden="1" w:unhideWhenUsed="1"/>
+    <w:lsdException w:name="HTML Variable" w:semiHidden="1" w:unhideWhenUsed="1"/>
+    <w:lsdException w:name="Normal Table" w:semiHidden="1" w:unhideWhenUsed="1"/>
+    <w:lsdException w:name="annotation subject" w:semiHidden="1" w:unhideWhenUsed="1"/>
+    <w:lsdException w:name="No List" w:semiHidden="1" w:unhideWhenUsed="1"/>
+    <w:lsdException w:name="Outline List 1" w:semiHidden="1" w:unhideWhenUsed="1"/>
+    <w:lsdException w:name="Outline List 2" w:semiHidden="1" w:unhideWhenUsed="1"/>
+    <w:lsdException w:name="Outline List 3" w:semiHidden="1" w:unhideWhenUsed="1"/>
+    <w:lsdException w:name="Table Simple 1" w:semiHidden="1" w:unhideWhenUsed="1"/>
+    <w:lsdException w:name="Table Simple 2" w:semiHidden="1" w:unhideWhenUsed="1"/>
+    <w:lsdException w:name="Table Simple 3" w:semiHidden="1" w:unhideWhenUsed="1"/>
+    <w:lsdException w:name="Table Classic 1" w:semiHidden="1" w:unhideWhenUsed="1"/>
+    <w:lsdException w:name="Table Classic 2" w:semiHidden="1" w:unhideWhenUsed="1"/>
+    <w:lsdException w:name="Table Classic 3" w:semiHidden="1" w:unhideWhenUsed="1"/>
+    <w:lsdException w:name="Table Classic 4" w:semiHidden="1" w:unhideWhenUsed="1"/>
+    <w:lsdException w:name="Table Colorful 1" w:semiHidden="1" w:unhideWhenUsed="1"/>
+    <w:lsdException w:name="Table Colorful 2" w:semiHidden="1" w:unhideWhenUsed="1"/>
+    <w:lsdException w:name="Table Colorful 3" w:semiHidden="1" w:unhideWhenUsed="1"/>
+    <w:lsdException w:name="Table Columns 1" w:semiHidden="1" w:unhideWhenUsed="1"/>
+    <w:lsdException w:name="Table Columns 2" w:semiHidden="1" w:unhideWhenUsed="1"/>
+    <w:lsdException w:name="Table Columns 3" w:semiHidden="1" w:unhideWhenUsed="1"/>
+    <w:lsdException w:name="Table Columns 4" w:semiHidden="1" w:unhideWhenUsed="1"/>
+    <w:lsdException w:name="Table Columns 5" w:semiHidden="1" w:unhideWhenUsed="1"/>
+    <w:lsdException w:name="Table Grid 1" w:semiHidden="1" w:unhideWhenUsed="1"/>
+    <w:lsdException w:name="Table Grid 2" w:semiHidden="1" w:unhideWhenUsed="1"/>
+    <w:lsdException w:name="Table Grid 3" w:semiHidden="1" w:unhideWhenUsed="1"/>
+    <w:lsdException w:name="Table Grid 4" w:semiHidden="1" w:unhideWhenUsed="1"/>
+    <w:lsdException w:name="Table Grid 5" w:semiHidden="1" w:unhideWhenUsed="1"/>
+    <w:lsdException w:name="Table Grid 6" w:semiHidden="1" w:unhideWhenUsed="1"/>
+    <w:lsdException w:name="Table Grid 7" w:semiHidden="1" w:unhideWhenUsed="1"/>
+    <w:lsdException w:name="Table Grid 8" w:semiHidden="1" w:unhideWhenUsed="1"/>
+    <w:lsdException w:name="Table List 1" w:semiHidden="1" w:unhideWhenUsed="1"/>
+    <w:lsdException w:name="Table List 2" w:semiHidden="1" w:unhideWhenUsed="1"/>
+    <w:lsdException w:name="Table List 3" w:semiHidden="1" w:unhideWhenUsed="1"/>
+    <w:lsdException w:name="Table List 4" w:semiHidden="1" w:unhideWhenUsed="1"/>
+    <w:lsdException w:name="Table List 5" w:semiHidden="1" w:unhideWhenUsed="1"/>
+    <w:lsdException w:name="Table List 6" w:semiHidden="1" w:unhideWhenUsed="1"/>
+    <w:lsdException w:name="Table List 7" w:semiHidden="1" w:unhideWhenUsed="1"/>
+    <w:lsdException w:name="Table List 8" w:semiHidden="1" w:unhideWhenUsed="1"/>
+    <w:lsdException w:name="Table 3D effects 1" w:semiHidden="1" w:unhideWhenUsed="1"/>
+    <w:lsdException w:name="Table 3D effects 2" w:semiHidden="1" w:unhideWhenUsed="1"/>
+    <w:lsdException w:name="Table 3D effects 3" w:semiHidden="1" w:unhideWhenUsed="1"/>
+    <w:lsdException w:name="Table Contemporary" w:semiHidden="1" w:unhideWhenUsed="1"/>
+    <w:lsdException w:name="Table Elegant" w:semiHidden="1" w:unhideWhenUsed="1"/>
+    <w:lsdException w:name="Table Professional" w:semiHidden="1" w:unhideWhenUsed="1"/>
+    <w:lsdException w:name="Table Subtle 1" w:semiHidden="1" w:unhideWhenUsed="1"/>
+    <w:lsdException w:name="Table Subtle 2" w:semiHidden="1" w:unhideWhenUsed="1"/>
+    <w:lsdException w:name="Table Web 1" w:semiHidden="1" w:unhideWhenUsed="1"/>
+    <w:lsdException w:name="Table Web 2" w:semiHidden="1" w:unhideWhenUsed="1"/>
+    <w:lsdException w:name="Table Web 3" w:semiHidden="1" w:unhideWhenUsed="1"/>
+    <w:lsdException w:name="Balloon Text" w:semiHidden="1" w:unhideWhenUsed="1"/>
+    <w:lsdException w:name="Table Grid" w:uiPriority="39"/>
+    <w:lsdException w:name="Table Theme" w:semiHidden="1" w:unhideWhenUsed="1"/>
+    <w:lsdException w:name="Placeholder Text" w:semiHidden="1"/>
+    <w:lsdException w:name="No Spacing" w:uiPriority="1" w:qFormat="1"/>
+    <w:lsdException w:name="Light Shading" w:uiPriority="60"/>
+    <w:lsdException w:name="Light List" w:uiPriority="61"/>
+    <w:lsdException w:name="Light Grid" w:uiPriority="62"/>
+    <w:lsdException w:name="Medium Shading 1" w:uiPriority="63"/>
+    <w:lsdException w:name="Medium Shading 2" w:uiPriority="64"/>
+    <w:lsdException w:name="Medium List 1" w:uiPriority="65"/>
+    <w:lsdException w:name="Medium List 2" w:uiPriority="66"/>
+    <w:lsdException w:name="Medium Grid 1" w:uiPriority="67"/>
+    <w:lsdException w:name="Medium Grid 2" w:uiPriority="68"/>
+    <w:lsdException w:name="Medium Grid 3" w:uiPriority="69"/>
+    <w:lsdException w:name="Dark List" w:uiPriority="70"/>
+    <w:lsdException w:name="Colorful Shading" w:uiPriority="71"/>
+    <w:lsdException w:name="Colorful List" w:uiPriority="72"/>
+    <w:lsdException w:name="Colorful Grid" w:uiPriority="73"/>
+    <w:lsdException w:name="Light Shading Accent 1" w:uiPriority="60"/>
+    <w:lsdException w:name="Light List Accent 1" w:uiPriority="61"/>
+    <w:lsdException w:name="Light Grid Accent 1" w:uiPriority="62"/>
+    <w:lsdException w:name="Medium Shading 1 Accent 1" w:uiPriority="63"/>
+    <w:lsdException w:name="Medium Shading 2 Accent 1" w:uiPriority="64"/>
+    <w:lsdException w:name="Medium List 1 Accent 1" w:uiPriority="65"/>
+    <w:lsdException w:name="Revision" w:semiHidden="1"/>
+    <w:lsdException w:name="List Paragraph" w:uiPriority="34" w:qFormat="1"/>
+    <w:lsdException w:name="Quote" w:uiPriority="29" w:qFormat="1"/>
+    <w:lsdException w:name="Intense Quote" w:uiPriority="30" w:qFormat="1"/>
+    <w:lsdException w:name="Medium List 2 Accent 1" w:uiPriority="66"/>
+    <w:lsdException w:name="Medium Grid 1 Accent 1" w:uiPriority="67"/>
+    <w:lsdException w:name="Medium Grid 2 Accent 1" w:uiPriority="68"/>
+    <w:lsdException w:name="Medium Grid 3 Accent 1" w:uiPriority="69"/>
+    <w:lsdException w:name="Dark List Accent 1" w:uiPriority="70"/>
+    <w:lsdException w:name="Colorful Shading Accent 1" w:uiPriority="71"/>
+    <w:lsdException w:name="Colorful List Accent 1" w:uiPriority="72"/>
+    <w:lsdException w:name="Colorful Grid Accent 1" w:uiPriority="73"/>
+    <w:lsdException w:name="Light Shading Accent 2" w:uiPriority="60"/>
+    <w:lsdException w:name="Light List Accent 2" w:uiPriority="61"/>
+    <w:lsdException w:name="Light Grid Accent 2" w:uiPriority="62"/>
+    <w:lsdException w:name="Medium Shading 1 Accent 2" w:uiPriority="63"/>
+    <w:lsdException w:name="Medium Shading 2 Accent 2" w:uiPriority="64"/>
+    <w:lsdException w:name="Medium List 1 Accent 2" w:uiPriority="65"/>
+    <w:lsdException w:name="Medium List 2 Accent 2" w:uiPriority="66"/>
+    <w:lsdException w:name="Medium Grid 1 Accent 2" w:uiPriority="67"/>
+    <w:lsdException w:name="Medium Grid 2 Accent 2" w:uiPriority="68"/>
+    <w:lsdException w:name="Medium Grid 3 Accent 2" w:uiPriority="69"/>
+    <w:lsdException w:name="Dark List Accent 2" w:uiPriority="70"/>
+    <w:lsdException w:name="Colorful Shading Accent 2" w:uiPriority="71"/>
+    <w:lsdException w:name="Colorful List Accent 2" w:uiPriority="72"/>
+    <w:lsdException w:name="Colorful Grid Accent 2" w:uiPriority="73"/>
+    <w:lsdException w:name="Light Shading Accent 3" w:uiPriority="60"/>
+    <w:lsdException w:name="Light List Accent 3" w:uiPriority="61"/>
+    <w:lsdException w:name="Light Grid Accent 3" w:uiPriority="62"/>
+    <w:lsdException w:name="Medium Shading 1 Accent 3" w:uiPriority="63"/>
+    <w:lsdException w:name="Medium Shading 2 Accent 3" w:uiPriority="64"/>
+    <w:lsdException w:name="Medium List 1 Accent 3" w:uiPriority="65"/>
+    <w:lsdException w:name="Medium List 2 Accent 3" w:uiPriority="66"/>
+    <w:lsdException w:name="Medium Grid 1 Accent 3" w:uiPriority="67"/>
+    <w:lsdException w:name="Medium Grid 2 Accent 3" w:uiPriority="68"/>
+    <w:lsdException w:name="Medium Grid 3 Accent 3" w:uiPriority="69"/>
+    <w:lsdException w:name="Dark List Accent 3" w:uiPriority="70"/>
+    <w:lsdException w:name="Colorful Shading Accent 3" w:uiPriority="71"/>
+    <w:lsdException w:name="Colorful List Accent 3" w:uiPriority="72"/>
+    <w:lsdException w:name="Colorful Grid Accent 3" w:uiPriority="73"/>
+    <w:lsdException w:name="Light Shading Accent 4" w:uiPriority="60"/>
+    <w:lsdException w:name="Light List Accent 4" w:uiPriority="61"/>
+    <w:lsdException w:name="Light Grid Accent 4" w:uiPriority="62"/>
+    <w:lsdException w:name="Medium Shading 1 Accent 4" w:uiPriority="63"/>
+    <w:lsdException w:name="Medium Shading 2 Accent 4" w:uiPriority="64"/>
+    <w:lsdException w:name="Medium List 1 Accent 4" w:uiPriority="65"/>
+    <w:lsdException w:name="Medium List 2 Accent 4" w:uiPriority="66"/>
+    <w:lsdException w:name="Medium Grid 1 Accent 4" w:uiPriority="67"/>
+    <w:lsdException w:name="Medium Grid 2 Accent 4" w:uiPriority="68"/>
+    <w:lsdException w:name="Medium Grid 3 Accent 4" w:uiPriority="69"/>
+    <w:lsdException w:name="Dark List Accent 4" w:uiPriority="70"/>
+    <w:lsdException w:name="Colorful Shading Accent 4" w:uiPriority="71"/>
+    <w:lsdException w:name="Colorful List Accent 4" w:uiPriority="72"/>
+    <w:lsdException w:name="Colorful Grid Accent 4" w:uiPriority="73"/>
+    <w:lsdException w:name="Light Shading Accent 5" w:uiPriority="60"/>
+    <w:lsdException w:name="Light List Accent 5" w:uiPriority="61"/>
+    <w:lsdException w:name="Light Grid Accent 5" w:uiPriority="62"/>
+    <w:lsdException w:name="Medium Shading 1 Accent 5" w:uiPriority="63"/>
+    <w:lsdException w:name="Medium Shading 2 Accent 5" w:uiPriority="64"/>
+    <w:lsdException w:name="Medium List 1 Accent 5" w:uiPriority="65"/>
+    <w:lsdException w:name="Medium List 2 Accent 5" w:uiPriority="66"/>
+    <w:lsdException w:name="Medium Grid 1 Accent 5" w:uiPriority="67"/>
+    <w:lsdException w:name="Medium Grid 2 Accent 5" w:uiPriority="68"/>
+    <w:lsdException w:name="Medium Grid 3 Accent 5" w:uiPriority="69"/>
+    <w:lsdException w:name="Dark List Accent 5" w:uiPriority="70"/>
+    <w:lsdException w:name="Colorful Shading Accent 5" w:uiPriority="71"/>
+    <w:lsdException w:name="Colorful List Accent 5" w:uiPriority="72"/>
+    <w:lsdException w:name="Colorful Grid Accent 5" w:uiPriority="73"/>
+    <w:lsdException w:name="Light Shading Accent 6" w:uiPriority="60"/>
+    <w:lsdException w:name="Light List Accent 6" w:uiPriority="61"/>
+    <w:lsdException w:name="Light Grid Accent 6" w:uiPriority="62"/>
+    <w:lsdException w:name="Medium Shading 1 Accent 6" w:uiPriority="63"/>
+    <w:lsdException w:name="Medium Shading 2 Accent 6" w:uiPriority="64"/>
+    <w:lsdException w:name="Medium List 1 Accent 6" w:uiPriority="65"/>
+    <w:lsdException w:name="Medium List 2 Accent 6" w:uiPriority="66"/>
+    <w:lsdException w:name="Medium Grid 1 Accent 6" w:uiPriority="67"/>
+    <w:lsdException w:name="Medium Grid 2 Accent 6" w:uiPriority="68"/>
+    <w:lsdException w:name="Medium Grid 3 Accent 6" w:uiPriority="69"/>
+    <w:lsdException w:name="Dark List Accent 6" w:uiPriority="70"/>
+    <w:lsdException w:name="Colorful Shading Accent 6" w:uiPriority="71"/>
+    <w:lsdException w:name="Colorful List Accent 6" w:uiPriority="72"/>
+    <w:lsdException w:name="Colorful Grid Accent 6" w:uiPriority="73"/>
+    <w:lsdException w:name="Subtle Emphasis" w:uiPriority="19" w:qFormat="1"/>
+    <w:lsdException w:name="Intense Emphasis" w:uiPriority="21" w:qFormat="1"/>
+    <w:lsdException w:name="Subtle Reference" w:uiPriority="31" w:qFormat="1"/>
+    <w:lsdException w:name="Intense Reference" w:uiPriority="32" w:qFormat="1"/>
+    <w:lsdException w:name="Book Title" w:uiPriority="33" w:qFormat="1"/>
+    <w:lsdException w:name="Bibliography" w:uiPriority="37" w:semiHidden="1" w:unhideWhenUsed="1"/>
+    <w:lsdException w:name="TOC Heading" w:uiPriority="39" w:qFormat="1" w:semiHidden="1" w:unhideWhenUsed="1"/>
+    <w:lsdException w:name="Plain Table 1" w:uiPriority="41"/>
+    <w:lsdException w:name="Plain Table 2" w:uiPriority="42"/>
+    <w:lsdException w:name="Plain Table 3" w:uiPriority="43"/>
+    <w:lsdException w:name="Plain Table 4" w:uiPriority="44"/>
+    <w:lsdException w:name="Plain Table 5" w:uiPriority="45"/>
+    <w:lsdException w:name="Grid Table Light" w:uiPriority="40"/>
+    <w:lsdException w:name="Grid Table 1 Light" w:uiPriority="46"/>
+    <w:lsdException w:name="Grid Table 2" w:uiPriority="47"/>
+    <w:lsdException w:name="Grid Table 3" w:uiPriority="48"/>
+    <w:lsdException w:name="Grid Table 4" w:uiPriority="49"/>
+    <w:lsdException w:name="Grid Table 5 Dark" w:uiPriority="50"/>
+    <w:lsdException w:name="Grid Table 6 Colorful" w:uiPriority="51"/>
+    <w:lsdException w:name="Grid Table 7 Colorful" w:uiPriority="52"/>
+    <w:lsdException w:name="Grid Table 1 Light Accent 1" w:uiPriority="46"/>
+    <w:lsdException w:name="Grid Table 2 Accent 1" w:uiPriority="47"/>
+    <w:lsdException w:name="Grid Table 3 Accent 1" w:uiPriority="48"/>
+    <w:lsdException w:name="Grid Table 4 Accent 1" w:uiPriority="49"/>
+    <w:lsdException w:name="Grid Table 5 Dark Accent 1" w:uiPriority="50"/>
+    <w:lsdException w:name="Grid Table 6 Colorful Accent 1" w:uiPriority="51"/>
+    <w:lsdException w:name="Grid Table 7 Colorful Accent 1" w:uiPriority="52"/>
+    <w:lsdException w:name="Grid Table 1 Light Accent 2" w:uiPriority="46"/>
+    <w:lsdException w:name="Grid Table 2 Accent 2" w:uiPriority="47"/>
+    <w:lsdException w:name="Grid Table 3 Accent 2" w:uiPriority="48"/>
+    <w:lsdException w:name="Grid Table 4 Accent 2" w:uiPriority="49"/>
+    <w:lsdException w:name="Grid Table 5 Dark Accent 2" w:uiPriority="50"/>
+    <w:lsdException w:name="Grid Table 6 Colorful Accent 2" w:uiPriority="51"/>
+    <w:lsdException w:name="Grid Table 7 Colorful Accent 2" w:uiPriority="52"/>
+    <w:lsdException w:name="Grid Table 1 Light Accent 3" w:uiPriority="46"/>
+    <w:lsdException w:name="Grid Table 2 Accent 3" w:uiPriority="47"/>
+    <w:lsdException w:name="Grid Table 3 Accent 3" w:uiPriority="48"/>
+    <w:lsdException w:name="Grid Table 4 Accent 3" w:uiPriority="49"/>
+    <w:lsdException w:name="Grid Table 5 Dark Accent 3" w:uiPriority="50"/>
+    <w:lsdException w:name="Grid Table 6 Colorful Accent 3" w:uiPriority="51"/>
+    <w:lsdException w:name="Grid Table 7 Colorful Accent 3" w:uiPriority="52"/>
+    <w:lsdException w:name="Grid Table 1 Light Accent 4" w:uiPriority="46"/>
+    <w:lsdException w:name="Grid Table 2 Accent 4" w:uiPriority="47"/>
+    <w:lsdException w:name="Grid Table 3 Accent 4" w:uiPriority="48"/>
+    <w:lsdException w:name="Grid Table 4 Accent 4" w:uiPriority="49"/>
+    <w:lsdException w:name="Grid Table 5 Dark Accent 4" w:uiPriority="50"/>
+    <w:lsdException w:name="Grid Table 6 Colorful Accent 4" w:uiPriority="51"/>
+    <w:lsdException w:name="Grid Table 7 Colorful Accent 4" w:uiPriority="52"/>
+    <w:lsdException w:name="Grid Table 1 Light Accent 5" w:uiPriority="46"/>
+    <w:lsdException w:name="Grid Table 2 Accent 5" w:uiPriority="47"/>
+    <w:lsdException w:name="Grid Table 3 Accent 5" w:uiPriority="48"/>
+    <w:lsdException w:name="Grid Table 4 Accent 5" w:uiPriority="49"/>
+    <w:lsdException w:name="Grid Table 5 Dark Accent 5" w:uiPriority="50"/>
+    <w:lsdException w:name="Grid Table 6 Colorful Accent 5" w:uiPriority="51"/>
+    <w:lsdException w:name="Grid Table 7 Colorful Accent 5" w:uiPriority="52"/>
+    <w:lsdException w:name="Grid Table 1 Light Accent 6" w:uiPriority="46"/>
+    <w:lsdException w:name="Grid Table 2 Accent 6" w:uiPriority="47"/>
+    <w:lsdException w:name="Grid Table 3 Accent 6" w:uiPriority="48"/>
+    <w:lsdException w:name="Grid Table 4 Accent 6" w:uiPriority="49"/>
+    <w:lsdException w:name="Grid Table 5 Dark Accent 6" w:uiPriority="50"/>
+    <w:lsdException w:name="Grid Table 6 Colorful Accent 6" w:uiPriority="51"/>
+    <w:lsdException w:name="Grid Table 7 Colorful Accent 6" w:uiPriority="52"/>
+    <w:lsdException w:name="List Table 1 Light" w:uiPriority="46"/>
+    <w:lsdException w:name="List Table 2" w:uiPriority="47"/>
+    <w:lsdException w:name="List Table 3" w:uiPriority="48"/>
+    <w:lsdException w:name="List Table 4" w:uiPriority="49"/>
+    <w:lsdException w:name="List Table 5 Dark" w:uiPriority="50"/>
+    <w:lsdException w:name="List Table 6 Colorful" w:uiPriority="51"/>
+    <w:lsdException w:name="List Table 7 Colorful" w:uiPriority="52"/>
+    <w:lsdException w:name="List Table 1 Light Accent 1" w:uiPriority="46"/>
+    <w:lsdException w:name="List Table 2 Accent 1" w:uiPriority="47"/>
+    <w:lsdException w:name="List Table 3 Accent 1" w:uiPriority="48"/>
+    <w:lsdException w:name="List Table 4 Accent 1" w:uiPriority="49"/>
+    <w:lsdException w:name="List Table 5 Dark Accent 1" w:uiPriority="50"/>
+    <w:lsdException w:name="List Table 6 Colorful Accent 1" w:uiPriority="51"/>
+    <w:lsdException w:name="List Table 7 Colorful Accent 1" w:uiPriority="52"/>
+    <w:lsdException w:name="List Table 1 Light Accent 2" w:uiPriority="46"/>
+    <w:lsdException w:name="List Table 2 Accent 2" w:uiPriority="47"/>
+    <w:lsdException w:name="List Table 3 Accent 2" w:uiPriority="48"/>
+    <w:lsdException w:name="List Table 4 Accent 2" w:uiPriority="49"/>
+    <w:lsdException w:name="List Table 5 Dark Accent 2" w:uiPriority="50"/>
+    <w:lsdException w:name="List Table 6 Colorful Accent 2" w:uiPriority="51"/>
+    <w:lsdException w:name="List Table 7 Colorful Accent 2" w:uiPriority="52"/>
+    <w:lsdException w:name="List Table 1 Light Accent 3" w:uiPriority="46"/>
+    <w:lsdException w:name="List Table 2 Accent 3" w:uiPriority="47"/>
+    <w:lsdException w:name="List Table 3 Accent 3" w:uiPriority="48"/>
+    <w:lsdException w:name="List Table 4 Accent 3" w:uiPriority="49"/>
+    <w:lsdException w:name="List Table 5 Dark Accent 3" w:uiPriority="50"/>
+    <w:lsdException w:name="List Table 6 Colorful Accent 3" w:uiPriority="51"/>
+    <w:lsdException w:name="List Table 7 Colorful Accent 3" w:uiPriority="52"/>
+    <w:lsdException w:name="List Table 1 Light Accent 4" w:uiPriority="46"/>
+    <w:lsdException w:name="List Table 2 Accent 4" w:uiPriority="47"/>
+    <w:lsdException w:name="List Table 3 Accent 4" w:uiPriority="48"/>
+    <w:lsdException w:name="List Table 4 Accent 4" w:uiPriority="49"/>
+    <w:lsdException w:name="List Table 5 Dark Accent 4" w:uiPriority="50"/>
+    <w:lsdException w:name="List Table 6 Colorful Accent 4" w:uiPriority="51"/>
+    <w:lsdException w:name="List Table 7 Colorful Accent 4" w:uiPriority="52"/>
+    <w:lsdException w:name="List Table 1 Light Accent 5" w:uiPriority="46"/>
+    <w:lsdException w:name="List Table 2 Accent 5" w:uiPriority="47"/>
+    <w:lsdException w:name="List Table 3 Accent 5" w:uiPriority="48"/>
+    <w:lsdException w:name="List Table 4 Accent 5" w:uiPriority="49"/>
+    <w:lsdException w:name="List Table 5 Dark Accent 5" w:uiPriority="50"/>
+    <w:lsdException w:name="List Table 6 Colorful Accent 5" w:uiPriority="51"/>
+    <w:lsdException w:name="List Table 7 Colorful Accent 5" w:uiPriority="52"/>
+    <w:lsdException w:name="List Table 1 Light Accent 6" w:uiPriority="46"/>
+    <w:lsdException w:name="List Table 2 Accent 6" w:uiPriority="47"/>
+    <w:lsdException w:name="List Table 3 Accent 6" w:uiPriority="48"/>
+    <w:lsdException w:name="List Table 4 Accent 6" w:uiPriority="49"/>
+    <w:lsdException w:name="List Table 5 Dark Accent 6" w:uiPriority="50"/>
+    <w:lsdException w:name="List Table 6 Colorful Accent 6" w:uiPriority="51"/>
+    <w:lsdException w:name="List Table 7 Colorful Accent 6" w:uiPriority="52"/>
+    <w:lsdException w:name="Mention" w:semiHidden="1" w:unhideWhenUsed="1"/>
+    <w:lsdException w:name="Smart Hyperlink" w:semiHidden="1" w:unhideWhenUsed="1"/>
+    <w:lsdException w:name="Hashtag" w:semiHidden="1" w:unhideWhenUsed="1"/>
+    <w:lsdException w:name="Unresolved Mention" w:semiHidden="1" w:unhideWhenUsed="1"/>
+    <w:lsdException w:name="Smart Link" w:semiHidden="1" w:unhideWhenUsed="1"/>
+  </w:latentStyles>
+  <w:style w:type="paragraph" w:styleId="Normal" w:default="1">
+    <w:name w:val="Normal"/>
+    <w:qFormat/>
+  </w:style>
+  <w:style w:type="character" w:styleId="DefaultParagraphFont" w:default="1">
+    <w:name w:val="Default Paragraph Font"/>
+  </w:style>
+  <w:style w:type="paragraph" w:styleId="Heading1">
+    <w:name w:val="Heading 1"/>
+    <w:basedOn w:val="Normal"/>
+    <w:next w:val="Normal"/>
+    <w:uiPriority w:val="9"/>
+    <w:qFormat/>
+    <w:pPr>
+      <w:spacing w:before="320" w:after="0"/>
+      <w:outlineLvl/>
+    </w:pPr>
+    <w:rPr>
+      <w:rFonts w:ascii="Calibri Light" w:hAnsi="Calibri Light"/>
+      <w:sz/>
+      <w:b/>
+      <w:color/>
+    </w:rPr>
+  </w:style>
+  <w:style w:type="paragraph" w:styleId="Heading2">
+    <w:name w:val="Heading 2"/>
+    <w:basedOn w:val="Normal"/>
+    <w:next w:val="Normal"/>
+    <w:uiPriority w:val="10"/>
+    <w:qFormat/>
+    <w:pPr>
+      <w:spacing w:before="400" w:after="0"/>
+      <w:outlineLvl/>
+    </w:pPr>
+    <w:rPr>
+      <w:rFonts w:ascii="Calibri Light" w:hAnsi="Calibri Light"/>
+      <w:sz/>
+      <w:b/>
+      <w:color/>
+    </w:rPr>
+  </w:style>
+  <w:style w:type="paragraph" w:styleId="Heading3">
+    <w:name w:val="Heading 3"/>
+    <w:basedOn w:val="Normal"/>
+    <w:next w:val="Normal"/>
+    <w:uiPriority w:val="11"/>
+    <w:qFormat/>
+    <w:pPr>
+      <w:spacing w:before="480" w:after="0"/>
+      <w:outlineLvl/>
+    </w:pPr>
+    <w:rPr>
+      <w:rFonts w:ascii="Calibri" w:hAnsi="Calibri"/>
+      <w:sz/>
+      <w:b/>
+      <w:color/>
+    </w:rPr>
+  </w:style>
+  <w:style w:type="paragraph" w:styleId="Heading4">
+    <w:name w:val="Heading 4"/>
+    <w:basedOn w:val="Normal"/>
+    <w:next w:val="Normal"/>
+    <w:uiPriority w:val="12"/>
+    <w:qFormat/>
+    <w:pPr>
+      <w:spacing w:before="560" w:after="0"/>
+      <w:outlineLvl/>
+    </w:pPr>
+    <w:rPr>
+      <w:rFonts w:ascii="Calibri" w:hAnsi="Calibri"/>
+      <w:sz/>
+      <w:b/>
+      <w:color/>
+    </w:rPr>
+  </w:style>
+  <w:style w:type="paragraph" w:styleId="Heading5">
+    <w:name w:val="Heading 5"/>
+    <w:basedOn w:val="Normal"/>
+    <w:next w:val="Normal"/>
+    <w:uiPriority w:val="13"/>
+    <w:qFormat/>
+    <w:pPr>
+      <w:spacing w:before="640" w:after="0"/>
+      <w:outlineLvl/>
+    </w:pPr>
+    <w:rPr>
+      <w:rFonts w:ascii="Calibri" w:hAnsi="Calibri"/>
+      <w:sz/>
+      <w:b/>
+      <w:color/>
+    </w:rPr>
+  </w:style>
+  <w:style w:type="paragraph" w:styleId="Heading6">
+    <w:name w:val="Heading 6"/>
+    <w:basedOn w:val="Normal"/>
+    <w:next w:val="Normal"/>
+    <w:uiPriority w:val="14"/>
+    <w:qFormat/>
+    <w:pPr>
+      <w:spacing w:before="720" w:after="0"/>
+      <w:outlineLvl/>
+    </w:pPr>
+    <w:rPr>
+      <w:rFonts w:ascii="Calibri" w:hAnsi="Calibri"/>
+      <w:sz/>
+      <w:b/>
+      <w:color/>
+    </w:rPr>
+  </w:style>
+  <w:style w:type="paragraph" w:styleId="Heading7">
+    <w:name w:val="Heading 7"/>
+    <w:basedOn w:val="Normal"/>
+    <w:next w:val="Normal"/>
+    <w:uiPriority w:val="15"/>
+    <w:qFormat/>
+    <w:pPr>
+      <w:spacing w:before="800" w:after="0"/>
+      <w:outlineLvl/>
+    </w:pPr>
+    <w:rPr>
+      <w:rFonts w:ascii="Calibri" w:hAnsi="Calibri"/>
+      <w:sz/>
+      <w:b/>
+      <w:color/>
+    </w:rPr>
+  </w:style>
+  <w:style w:type="paragraph" w:styleId="Heading8">
+    <w:name w:val="Heading 8"/>
+    <w:basedOn w:val="Normal"/>
+    <w:next w:val="Normal"/>
+    <w:uiPriority w:val="16"/>
+    <w:qFormat/>
+    <w:pPr>
+      <w:spacing w:before="880" w:after="0"/>
+      <w:outlineLvl/>
+    </w:pPr>
+    <w:rPr>
+      <w:rFonts w:ascii="Calibri" w:hAnsi="Calibri"/>
+      <w:sz/>
+      <w:b/>
+      <w:color/>
+    </w:rPr>
+  </w:style>
+  <w:style w:type="paragraph" w:styleId="Heading9">
+    <w:name w:val="Heading 9"/>
+    <w:basedOn w:val="Normal"/>
+    <w:next w:val="Normal"/>
+    <w:uiPriority w:val="17"/>
+    <w:qFormat/>
+    <w:pPr>
+      <w:spacing w:before="960" w:after="0"/>
+      <w:outlineLvl/>
+    </w:pPr>
+    <w:rPr>
+      <w:rFonts w:ascii="Calibri" w:hAnsi="Calibri"/>
+      <w:sz/>
+      <w:b/>
+      <w:color/>
+    </w:rPr>
+  </w:style>
+  <w:style w:type="character" w:styleId="Emphasis" w:customStyle="1">
+    <w:name w:val="Emphasis"/>
+    <w:rPr>
+      <w:i/>
+    </w:rPr>
+  </w:style>
+  <w:style w:type="character" w:styleId="Strong" w:customStyle="1">
+    <w:name w:val="Strong"/>
+    <w:rPr>
+      <w:b/>
+    </w:rPr>
+  </w:style>
+  <w:style w:type="table" w:styleId="TableNormal" w:default="1">
+    <w:name w:val="Normal Table"/>
+    <w:uiPriority w:val="99"/>
+    <w:semiHidden/>
+    <w:unhideWhenUsed/>
+    <w:tblPr>
+      <w:tblCellMar>
+        <w:top w:w="0" w:type="dxa"/>
+        <w:left w:w="108" w:type="dxa"/>
+        <w:bottom w:w="0" w:type="dxa"/>
+        <w:right w:w="108" w:type="dxa"/>
+      </w:tblCellMar>
+      <w:tblInd w:w="0" w:type="dxa"/>
+    </w:tblPr>
+  </w:style>
+  <w:style w:type="numbering" w:styleId="NoList" w:default="1">
+    <w:name w:val="No List"/>
+    <w:uiPriority w:val="99"/>
+    <w:semiHidden/>
+    <w:unhideWhenUsed/>
+  </w:style>
+</w:styles>
 </file>
 
 <file path=word/charts/chart1.xml><?xml version="1.0" encoding="utf-8"?>
@@ -870,4 +1311,70 @@
     <c:plotVisOnly val="1"/>
   </c:chart>
 </c:chartSpace>
+</file>
+
+<file path=word/theme/theme1.xml><?xml version="1.0" encoding="utf-8"?>
+<a:theme xmlns:a="http://schemas.openxmlformats.org/drawingml/2006/main" name="Corporate">
+  <a:themeElements>
+    <a:clrScheme name="Corporate">
+      <a:dk1>
+        <a:srgbClr val="000000"/>
+      </a:dk1>
+      <a:lt1>
+        <a:srgbClr val="FFFFFF"/>
+      </a:lt1>
+      <a:dk2>
+        <a:srgbClr val="44546A"/>
+      </a:dk2>
+      <a:lt2>
+        <a:srgbClr val="E7E6E6"/>
+      </a:lt2>
+      <a:accent1>
+        <a:srgbClr val="4472C4"/>
+      </a:accent1>
+      <a:accent2>
+        <a:srgbClr val="ED7D31"/>
+      </a:accent2>
+      <a:accent3>
+        <a:srgbClr val="A5A5A5"/>
+      </a:accent3>
+      <a:accent4>
+        <a:srgbClr val="FFC000"/>
+      </a:accent4>
+      <a:accent5>
+        <a:srgbClr val="5B9BD5"/>
+      </a:accent5>
+      <a:accent6>
+        <a:srgbClr val="70AD47"/>
+      </a:accent6>
+      <a:hlink>
+        <a:srgbClr val="0563C1"/>
+      </a:hlink>
+      <a:folHlink>
+        <a:srgbClr val="954F72"/>
+      </a:folHlink>
+    </a:clrScheme>
+    <a:fontScheme name="Corporate">
+      <a:majorFont>
+        <a:latin typeface="Carlito"/>
+        <a:ea typeface="Noto Sans CJK JP"/>
+        <a:cs typeface="Noto Sans Arabic"/>
+      </a:majorFont>
+      <a:minorFont>
+        <a:latin typeface="Carlito"/>
+        <a:ea typeface="Noto Sans CJK JP"/>
+        <a:cs typeface="Noto Sans Arabic"/>
+      </a:minorFont>
+    </a:fontScheme>
+    <a:fmtScheme>
+      <a:fillStyleLst/>
+      <a:lnStyleLst/>
+      <a:effectStyleLst/>
+      <a:bgFillStyleLst/>
+    </a:fmtScheme>
+  </a:themeElements>
+  <a:objectDefaults/>
+  <a:extraClrSchemeLst/>
+  <a:extLst/>
+</a:theme>
 </file>
</xml_diff>

<commit_message>
fix: expand Reconciler to match Word output fidelity
- Clear stored namespace plans so declare: :always scopes produce full
  namespace declarations on round-tripped documents (35 ns on document.xml)
- Add DoNotDisplayPageBoundaries to Settings model and Reconciler
- Set Office Theme name on reconciled themes
- Calculate document statistics in app properties
- Set lastModifiedBy from application_name when no user_name
- Expand mc:Ignorable on document.xml to include w16* namespaces
- Remove w15ChartTrackingRefBased, OptimizeForBrowser, AllowPng defaults
- Reorder font table entries to match Word canonical output
- Add default East Asian fonts for zh-CN locale
- Remove mixed_content from Types and StylesConfiguration
- Relax round-trip style count check (may add missing defaults)
</commit_message>
<xml_diff>
--- a/spec/examples/generated/academic_paper.docx
+++ b/spec/examples/generated/academic_paper.docx
@@ -1,6 +1,6 @@
 
-<file path=word/document.xml><?xml version="1.0" encoding="UTF-8"?>
-<w:document xmlns:w="http://schemas.openxmlformats.org/wordprocessingml/2006/main" xmlns:wpc="http://schemas.microsoft.com/office/word/2010/wordprocessingCanvas" xmlns:cx="http://schemas.microsoft.com/office/drawing/2014/chartex" xmlns:cx1="http://schemas.microsoft.com/office/drawing/2015/9/8/chartex" xmlns:cx2="http://schemas.microsoft.com/office/drawing/2015/10/21/chartex" xmlns:cx3="http://schemas.microsoft.com/office/drawing/2016/5/9/chartex" xmlns:cx4="http://schemas.microsoft.com/office/drawing/2016/5/10/chartex" xmlns:cx5="http://schemas.microsoft.com/office/drawing/2016/5/11/chartex" xmlns:cx6="http://schemas.microsoft.com/office/drawing/2016/5/12/chartex" xmlns:cx7="http://schemas.microsoft.com/office/drawing/2016/5/13/chartex" xmlns:cx8="http://schemas.microsoft.com/office/drawing/2016/5/14/chartex" xmlns:mc="http://schemas.openxmlformats.org/markup-compatibility/2006" xmlns:aink="http://schemas.microsoft.com/office/drawing/2016/ink" xmlns:am3d="http://schemas.microsoft.com/office/drawing/2017/model3d" xmlns:o="urn:schemas-microsoft-com:office:office" xmlns:oel="http://schemas.microsoft.com/office/2019/extlst" xmlns:r="http://schemas.openxmlformats.org/officeDocument/2006/relationships" xmlns:m="http://schemas.openxmlformats.org/officeDocument/2006/math" xmlns:v="urn:schemas-microsoft-com:vml" xmlns:wp14="http://schemas.microsoft.com/office/word/2010/wordprocessingDrawing" xmlns:wp="http://schemas.openxmlformats.org/drawingml/2006/wordprocessingDrawing" xmlns:w10="urn:schemas-microsoft-com:office:word" xmlns:w14="http://schemas.microsoft.com/office/word/2010/wordml" xmlns:w15="http://schemas.microsoft.com/office/word/2012/wordml" xmlns:w16cex="http://schemas.microsoft.com/office/word/2018/wordml/cex" xmlns:w16cid="http://schemas.microsoft.com/office/word/2016/wordml/cid" xmlns:w16="http://schemas.microsoft.com/office/word/2018/wordml" xmlns:w16du="http://schemas.microsoft.com/office/word/2023/wordml/word16du" xmlns:w16sdtdh="http://schemas.microsoft.com/office/word/2020/wordml/sdtdatahash" xmlns:w16sdtfl="http://schemas.microsoft.com/office/word/2024/wordml/sdtformatlock" xmlns:w16se="http://schemas.microsoft.com/office/word/2015/wordml/symex" xmlns:wpg="http://schemas.microsoft.com/office/word/2010/wordprocessingGroup" xmlns:wpi="http://schemas.microsoft.com/office/word/2010/wordprocessingInk" xmlns:wne="http://schemas.microsoft.com/office/word/2006/wordml" xmlns:wps="http://schemas.microsoft.com/office/word/2010/wordprocessingShape" mc:Ignorable="w14 w15 wp14">
+<file path=word/document.xml><?xml version="1.0" encoding="UTF-8" standalone="yes"?>
+<w:document xmlns:w="http://schemas.openxmlformats.org/wordprocessingml/2006/main" xmlns:wpc="http://schemas.microsoft.com/office/word/2010/wordprocessingCanvas" xmlns:cx="http://schemas.microsoft.com/office/drawing/2014/chartex" xmlns:cx1="http://schemas.microsoft.com/office/drawing/2015/9/8/chartex" xmlns:cx2="http://schemas.microsoft.com/office/drawing/2015/10/21/chartex" xmlns:cx3="http://schemas.microsoft.com/office/drawing/2016/5/9/chartex" xmlns:cx4="http://schemas.microsoft.com/office/drawing/2016/5/10/chartex" xmlns:cx5="http://schemas.microsoft.com/office/drawing/2016/5/11/chartex" xmlns:cx6="http://schemas.microsoft.com/office/drawing/2016/5/12/chartex" xmlns:cx7="http://schemas.microsoft.com/office/drawing/2016/5/13/chartex" xmlns:cx8="http://schemas.microsoft.com/office/drawing/2016/5/14/chartex" xmlns:mc="http://schemas.openxmlformats.org/markup-compatibility/2006" xmlns:aink="http://schemas.microsoft.com/office/drawing/2016/ink" xmlns:am3d="http://schemas.microsoft.com/office/drawing/2017/model3d" xmlns:o="urn:schemas-microsoft-com:office:office" xmlns:oel="http://schemas.microsoft.com/office/2019/extlst" xmlns:r="http://schemas.openxmlformats.org/officeDocument/2006/relationships" xmlns:m="http://schemas.openxmlformats.org/officeDocument/2006/math" xmlns:v="urn:schemas-microsoft-com:vml" xmlns:wp14="http://schemas.microsoft.com/office/word/2010/wordprocessingDrawing" xmlns:wp="http://schemas.openxmlformats.org/drawingml/2006/wordprocessingDrawing" xmlns:w10="urn:schemas-microsoft-com:office:word" xmlns:w14="http://schemas.microsoft.com/office/word/2010/wordml" xmlns:w15="http://schemas.microsoft.com/office/word/2012/wordml" xmlns:w16cex="http://schemas.microsoft.com/office/word/2018/wordml/cex" xmlns:w16cid="http://schemas.microsoft.com/office/word/2016/wordml/cid" xmlns:w16="http://schemas.microsoft.com/office/word/2018/wordml" xmlns:w16du="http://schemas.microsoft.com/office/word/2023/wordml/word16du" xmlns:w16sdtdh="http://schemas.microsoft.com/office/word/2020/wordml/sdtdatahash" xmlns:w16sdtfl="http://schemas.microsoft.com/office/word/2024/wordml/sdtformatlock" xmlns:w16se="http://schemas.microsoft.com/office/word/2015/wordml/symex" xmlns:wpg="http://schemas.microsoft.com/office/word/2010/wordprocessingGroup" xmlns:wpi="http://schemas.microsoft.com/office/word/2010/wordprocessingInk" xmlns:wne="http://schemas.microsoft.com/office/word/2006/wordml" xmlns:wps="http://schemas.microsoft.com/office/word/2010/wordprocessingShape" mc:Ignorable="w14 w15 w16se w16cid w16 w16cex w16sdtdh w16sdtfl w16du wp14">
   <w:body>
     <w:p>
       <w:pPr>
@@ -239,7 +239,7 @@
           <wp:inline>
             <wp:extent wp:cx="5486400" wp:cy="3200400"/>
             <wp:effectExtent/>
-            <wp:docPr wp:id="426917719" wp:name="Chart 507930"/>
+            <wp:docPr wp:id="153440379" wp:name="Chart 266133"/>
             <graphic xmlns="http://schemas.openxmlformats.org/drawingml/2006/main">
               <graphicData uri="http://schemas.openxmlformats.org/drawingml/2006/chart">
                 <chart xmlns="http://schemas.openxmlformats.org/drawingml/2006/chart" c:id="rIdChart1"/>
@@ -263,7 +263,7 @@
           <wp:inline>
             <wp:extent wp:cx="5486400" wp:cy="3200400"/>
             <wp:effectExtent/>
-            <wp:docPr wp:id="128941180" wp:name="Chart 822517"/>
+            <wp:docPr wp:id="256995778" wp:name="Chart 922461"/>
             <graphic xmlns="http://schemas.openxmlformats.org/drawingml/2006/main">
               <graphicData uri="http://schemas.openxmlformats.org/drawingml/2006/chart">
                 <chart xmlns="http://schemas.openxmlformats.org/drawingml/2006/chart" c:id="rIdChart2"/>
@@ -451,7 +451,7 @@
 </w:numbering>
 </file>
 
-<file path=word/sources.xml><?xml version="1.0" encoding="UTF-8"?>
+<file path=word/sources.xml><?xml version="1.0" encoding="UTF-8" standalone="yes"?>
 <Sources xmlns="http://schemas.openxmlformats.org/officeDocument/2006/bibliography" b:SelectedStyle="APA">
   <Source>
     <SourceType>Book</SourceType>
@@ -1314,7 +1314,7 @@
 </file>
 
 <file path=word/theme/theme1.xml><?xml version="1.0" encoding="utf-8"?>
-<a:theme xmlns:a="http://schemas.openxmlformats.org/drawingml/2006/main" name="Corporate">
+<a:theme xmlns:a="http://schemas.openxmlformats.org/drawingml/2006/main" name="Office Theme">
   <a:themeElements>
     <a:clrScheme name="Corporate">
       <a:dk1>

</xml_diff>

<commit_message>
fix: complete remaining TODO.repair items - useFELayout, ligatures, round-trip fidelity
- Add useFELayout to build_compat in settings.xml
- Add w14:ligatures (standardContextual) to docDefaults in styles.xml
- Preserve original app.xml statistics on round-trip (only compute for
  fresh documents where stats are missing)
- Preserve original app.xml static defaults on round-trip
- Update TODO.repair-bugs/07 status to fixed

All TODO.repair and TODO.repair-bugs items now complete.
Full suite: 6425 examples, 0 failures, 55 pending.
</commit_message>
<xml_diff>
--- a/spec/examples/generated/academic_paper.docx
+++ b/spec/examples/generated/academic_paper.docx
@@ -239,7 +239,7 @@
           <wp:inline>
             <wp:extent wp:cx="5486400" wp:cy="3200400"/>
             <wp:effectExtent/>
-            <wp:docPr wp:id="153440379" wp:name="Chart 266133"/>
+            <wp:docPr wp:id="448623726" wp:name="Chart 955688"/>
             <graphic xmlns="http://schemas.openxmlformats.org/drawingml/2006/main">
               <graphicData uri="http://schemas.openxmlformats.org/drawingml/2006/chart">
                 <chart xmlns="http://schemas.openxmlformats.org/drawingml/2006/chart" c:id="rIdChart1"/>
@@ -263,7 +263,7 @@
           <wp:inline>
             <wp:extent wp:cx="5486400" wp:cy="3200400"/>
             <wp:effectExtent/>
-            <wp:docPr wp:id="256995778" wp:name="Chart 922461"/>
+            <wp:docPr wp:id="778984815" wp:name="Chart 976596"/>
             <graphic xmlns="http://schemas.openxmlformats.org/drawingml/2006/main">
               <graphicData uri="http://schemas.openxmlformats.org/drawingml/2006/chart">
                 <chart xmlns="http://schemas.openxmlformats.org/drawingml/2006/chart" c:id="rIdChart2"/>
@@ -533,6 +533,7 @@
         <w:szCs/>
         <w:kern/>
         <w:lang w:val="en-US" w:eastAsia="zh-CN" w:bidi="ar-SA"/>
+        <w14:ligatures w14:val="standardContextual"/>
       </w:rPr>
     </w:rPrDefault>
     <w:pPrDefault>

</xml_diff>

<commit_message>
fix: use value= instead of val= for property constructors, force app defaults
- Reconciler's build_doc_defaults uses value: (not val:) for Kerning,
  FontSize, ColorValue, Underline, OutlineLevel to match lutaml-model
  attribute names
- App defaults use = (not ||=) to override lutaml-model's using_default
  tracking that would otherwise omit these from XML output
- Regenerate example DOCX files
</commit_message>
<xml_diff>
--- a/spec/examples/generated/academic_paper.docx
+++ b/spec/examples/generated/academic_paper.docx
@@ -239,7 +239,7 @@
           <wp:inline>
             <wp:extent wp:cx="5486400" wp:cy="3200400"/>
             <wp:effectExtent/>
-            <wp:docPr wp:id="448623726" wp:name="Chart 955688"/>
+            <wp:docPr wp:id="867360709" wp:name="Chart 201237"/>
             <graphic xmlns="http://schemas.openxmlformats.org/drawingml/2006/main">
               <graphicData uri="http://schemas.openxmlformats.org/drawingml/2006/chart">
                 <chart xmlns="http://schemas.openxmlformats.org/drawingml/2006/chart" c:id="rIdChart1"/>
@@ -263,7 +263,7 @@
           <wp:inline>
             <wp:extent wp:cx="5486400" wp:cy="3200400"/>
             <wp:effectExtent/>
-            <wp:docPr wp:id="778984815" wp:name="Chart 976596"/>
+            <wp:docPr wp:id="248401424" wp:name="Chart 132694"/>
             <graphic xmlns="http://schemas.openxmlformats.org/drawingml/2006/main">
               <graphicData uri="http://schemas.openxmlformats.org/drawingml/2006/chart">
                 <chart xmlns="http://schemas.openxmlformats.org/drawingml/2006/chart" c:id="rIdChart2"/>
@@ -529,9 +529,9 @@
     <w:rPrDefault>
       <w:rPr>
         <w:rFonts w:asciiTheme="minorHAnsi" w:eastAsiaTheme="minorEastAsia" w:hAnsiTheme="minorHAnsi" w:cstheme="minorBidi"/>
-        <w:sz/>
-        <w:szCs/>
-        <w:kern/>
+        <w:sz w:val="24"/>
+        <w:szCs w:val="24"/>
+        <w:kern w:val="2"/>
         <w:lang w:val="en-US" w:eastAsia="zh-CN" w:bidi="ar-SA"/>
         <w14:ligatures w14:val="standardContextual"/>
       </w:rPr>
@@ -935,13 +935,13 @@
     <w:qFormat/>
     <w:pPr>
       <w:spacing w:before="320" w:after="0"/>
-      <w:outlineLvl/>
+      <w:outlineLvl w:val="0"/>
     </w:pPr>
     <w:rPr>
       <w:rFonts w:ascii="Calibri Light" w:hAnsi="Calibri Light"/>
-      <w:sz/>
+      <w:sz w:val="32"/>
       <w:b/>
-      <w:color/>
+      <w:color w:val="2E74B5"/>
     </w:rPr>
   </w:style>
   <w:style w:type="paragraph" w:styleId="Heading2">
@@ -952,13 +952,13 @@
     <w:qFormat/>
     <w:pPr>
       <w:spacing w:before="400" w:after="0"/>
-      <w:outlineLvl/>
+      <w:outlineLvl w:val="1"/>
     </w:pPr>
     <w:rPr>
       <w:rFonts w:ascii="Calibri Light" w:hAnsi="Calibri Light"/>
-      <w:sz/>
+      <w:sz w:val="26"/>
       <w:b/>
-      <w:color/>
+      <w:color w:val="2E74B5"/>
     </w:rPr>
   </w:style>
   <w:style w:type="paragraph" w:styleId="Heading3">
@@ -969,13 +969,13 @@
     <w:qFormat/>
     <w:pPr>
       <w:spacing w:before="480" w:after="0"/>
-      <w:outlineLvl/>
+      <w:outlineLvl w:val="2"/>
     </w:pPr>
     <w:rPr>
       <w:rFonts w:ascii="Calibri" w:hAnsi="Calibri"/>
-      <w:sz/>
+      <w:sz w:val="24"/>
       <w:b/>
-      <w:color/>
+      <w:color w:val="1F4E79"/>
     </w:rPr>
   </w:style>
   <w:style w:type="paragraph" w:styleId="Heading4">
@@ -986,13 +986,13 @@
     <w:qFormat/>
     <w:pPr>
       <w:spacing w:before="560" w:after="0"/>
-      <w:outlineLvl/>
+      <w:outlineLvl w:val="3"/>
     </w:pPr>
     <w:rPr>
       <w:rFonts w:ascii="Calibri" w:hAnsi="Calibri"/>
-      <w:sz/>
+      <w:sz w:val="22"/>
       <w:b/>
-      <w:color/>
+      <w:color w:val="2E74B5"/>
     </w:rPr>
   </w:style>
   <w:style w:type="paragraph" w:styleId="Heading5">
@@ -1003,13 +1003,13 @@
     <w:qFormat/>
     <w:pPr>
       <w:spacing w:before="640" w:after="0"/>
-      <w:outlineLvl/>
+      <w:outlineLvl w:val="4"/>
     </w:pPr>
     <w:rPr>
       <w:rFonts w:ascii="Calibri" w:hAnsi="Calibri"/>
-      <w:sz/>
+      <w:sz w:val="20"/>
       <w:b/>
-      <w:color/>
+      <w:color w:val="2E74B5"/>
     </w:rPr>
   </w:style>
   <w:style w:type="paragraph" w:styleId="Heading6">
@@ -1020,13 +1020,13 @@
     <w:qFormat/>
     <w:pPr>
       <w:spacing w:before="720" w:after="0"/>
-      <w:outlineLvl/>
+      <w:outlineLvl w:val="5"/>
     </w:pPr>
     <w:rPr>
       <w:rFonts w:ascii="Calibri" w:hAnsi="Calibri"/>
-      <w:sz/>
+      <w:sz w:val="20"/>
       <w:b/>
-      <w:color/>
+      <w:color w:val="1F3763"/>
     </w:rPr>
   </w:style>
   <w:style w:type="paragraph" w:styleId="Heading7">
@@ -1037,13 +1037,13 @@
     <w:qFormat/>
     <w:pPr>
       <w:spacing w:before="800" w:after="0"/>
-      <w:outlineLvl/>
+      <w:outlineLvl w:val="6"/>
     </w:pPr>
     <w:rPr>
       <w:rFonts w:ascii="Calibri" w:hAnsi="Calibri"/>
-      <w:sz/>
+      <w:sz w:val="20"/>
       <w:b/>
-      <w:color/>
+      <w:color w:val="2E74B5"/>
     </w:rPr>
   </w:style>
   <w:style w:type="paragraph" w:styleId="Heading8">
@@ -1054,13 +1054,13 @@
     <w:qFormat/>
     <w:pPr>
       <w:spacing w:before="880" w:after="0"/>
-      <w:outlineLvl/>
+      <w:outlineLvl w:val="7"/>
     </w:pPr>
     <w:rPr>
       <w:rFonts w:ascii="Calibri" w:hAnsi="Calibri"/>
-      <w:sz/>
+      <w:sz w:val="20"/>
       <w:b/>
-      <w:color/>
+      <w:color w:val="2E74B5"/>
     </w:rPr>
   </w:style>
   <w:style w:type="paragraph" w:styleId="Heading9">
@@ -1071,13 +1071,13 @@
     <w:qFormat/>
     <w:pPr>
       <w:spacing w:before="960" w:after="0"/>
-      <w:outlineLvl/>
+      <w:outlineLvl w:val="8"/>
     </w:pPr>
     <w:rPr>
       <w:rFonts w:ascii="Calibri" w:hAnsi="Calibri"/>
-      <w:sz/>
+      <w:sz w:val="20"/>
       <w:b/>
-      <w:color/>
+      <w:color w:val="2E74B5"/>
     </w:rPr>
   </w:style>
   <w:style w:type="character" w:styleId="Emphasis" w:customStyle="1">

</xml_diff>

<commit_message>
refactor: remove convenience setters from model classes
Remove custom convenience setters/getters from model classes per
CLAUDE.md rule 'Model classes do NOT have custom getters or setters.'

Removed setters:
- Style: id=, style_name=, based_on=, next_style=, linked_style=, ui_priority=
- ParagraphProperties: keep_next=, keep_lines=, page_break_before=, widow_control=, left_indent=
- TableProperties: width=, cell_padding=, border setters, initialize convenience
- TableCellProperties: vertical_merge=
- TableRow: height=
- TableCell: text=, colspan=, rowspan=
- Paragraph: text=
- Text: text=
- DocumentRoot: title=
- Hyperlink: target= (restored - used by builders)
- TabStop: alignment=, position=
- RunProperties: shading_color=, page_break=, text_expansion=, all_caps=

Updated callers to use wrapper objects directly.
</commit_message>
<xml_diff>
--- a/spec/examples/generated/academic_paper.docx
+++ b/spec/examples/generated/academic_paper.docx
@@ -239,7 +239,7 @@
           <wp:inline>
             <wp:extent wp:cx="5486400" wp:cy="3200400"/>
             <wp:effectExtent/>
-            <wp:docPr wp:id="751302732" wp:name="Chart 827110"/>
+            <wp:docPr wp:id="496816236" wp:name="Chart 102869"/>
             <graphic xmlns="http://schemas.openxmlformats.org/drawingml/2006/main">
               <graphicData uri="http://schemas.openxmlformats.org/drawingml/2006/chart">
                 <chart xmlns="http://schemas.openxmlformats.org/drawingml/2006/chart" c:id="rIdChart1"/>
@@ -263,7 +263,7 @@
           <wp:inline>
             <wp:extent wp:cx="5486400" wp:cy="3200400"/>
             <wp:effectExtent/>
-            <wp:docPr wp:id="586260545" wp:name="Chart 968994"/>
+            <wp:docPr wp:id="364694658" wp:name="Chart 362850"/>
             <graphic xmlns="http://schemas.openxmlformats.org/drawingml/2006/main">
               <graphicData uri="http://schemas.openxmlformats.org/drawingml/2006/chart">
                 <chart xmlns="http://schemas.openxmlformats.org/drawingml/2006/chart" c:id="rIdChart2"/>

</xml_diff>

<commit_message>
test: add round-trip validation and repair verification specs
- semantic_rules_spec: tests for all 20 validation rules
- round_trip_validation_spec: 22 tests across 7 fixtures with DOC-100..DOC-109
- repair_spec: 19 tests verifying broken DOCX files are repaired like Word
- Update generated DOCX example binaries
</commit_message>
<xml_diff>
--- a/spec/examples/generated/academic_paper.docx
+++ b/spec/examples/generated/academic_paper.docx
@@ -239,7 +239,7 @@
           <wp:inline>
             <wp:extent wp:cx="5486400" wp:cy="3200400"/>
             <wp:effectExtent/>
-            <wp:docPr wp:id="538688254" wp:name="Chart 782041"/>
+            <wp:docPr wp:id="292113989" wp:name="Chart 643827"/>
             <graphic xmlns="http://schemas.openxmlformats.org/drawingml/2006/main">
               <graphicData uri="http://schemas.openxmlformats.org/drawingml/2006/chart">
                 <chart xmlns="http://schemas.openxmlformats.org/drawingml/2006/chart" c:id="rIdChart1"/>
@@ -263,7 +263,7 @@
           <wp:inline>
             <wp:extent wp:cx="5486400" wp:cy="3200400"/>
             <wp:effectExtent/>
-            <wp:docPr wp:id="566971723" wp:name="Chart 497959"/>
+            <wp:docPr wp:id="141418687" wp:name="Chart 197264"/>
             <graphic xmlns="http://schemas.openxmlformats.org/drawingml/2006/main">
               <graphicData uri="http://schemas.openxmlformats.org/drawingml/2006/chart">
                 <chart xmlns="http://schemas.openxmlformats.org/drawingml/2006/chart" c:id="rIdChart2"/>

</xml_diff>